<commit_message>
actualizacion de documentos de pruebas q/a
</commit_message>
<xml_diff>
--- a/docs/testing/01_Plan_de_Pruebas_QA.docx
+++ b/docs/testing/01_Plan_de_Pruebas_QA.docx
@@ -360,7 +360,7 @@
                 <w:sz w:val="19"/>
                 <w:szCs w:val="19"/>
               </w:rPr>
-              <w:t xml:space="preserve">14 de octubre de 2026, 12:48 a. m.</w:t>
+              <w:t xml:space="preserve">28 de octubre de 2026, 2:31 a. m.</w:t>
             </w:r>
           </w:p>
         </w:tc>
@@ -431,7 +431,7 @@
                 <w:sz w:val="19"/>
                 <w:szCs w:val="19"/>
               </w:rPr>
-              <w:t xml:space="preserve">rama sprint_4, commit d1ed711 (más 145 archivos con cambios sin commit)</w:t>
+              <w:t xml:space="preserve">rama cobertura-pruebas, commit 000f31c (más 58 archivos con cambios sin commit)</w:t>
             </w:r>
           </w:p>
         </w:tc>
@@ -502,7 +502,7 @@
                 <w:sz w:val="19"/>
                 <w:szCs w:val="19"/>
               </w:rPr>
-              <w:t xml:space="preserve">Regresión completa final (tras los merges de US-12, US-13 y US-21, SonarQube y OpenAPI). Automatizada con scripts (Jest, Playwright, cliente Socket.IO, scripts de shell) sobre el entorno Docker de pruebas</w:t>
+              <w:t xml:space="preserve">Ejecución completa desde cero. Automatizada con scripts (Jest, Playwright, cliente Socket.IO, scripts de shell) sobre el entorno Docker de pruebas</w:t>
             </w:r>
           </w:p>
         </w:tc>
@@ -573,7 +573,7 @@
                 <w:sz w:val="19"/>
                 <w:szCs w:val="19"/>
               </w:rPr>
-              <w:t xml:space="preserve">19 historias de usuario · 142 casos de prueba + 140 pruebas automatizadas del backend</w:t>
+              <w:t xml:space="preserve">19 historias de usuario · 142 casos de prueba + 157 pruebas automatizadas del backend</w:t>
             </w:r>
           </w:p>
         </w:tc>
@@ -15526,7 +15526,7 @@
                 <w:sz w:val="19"/>
                 <w:szCs w:val="19"/>
               </w:rPr>
-              <w:t xml:space="preserve">rama sprint_4 · commit d1ed711 (más 145 archivos con cambios sin commit) (+145 archivo(s) con cambios sin comitear)</w:t>
+              <w:t xml:space="preserve">rama cobertura-pruebas · commit 000f31c (más 58 archivos con cambios sin commit) (+58 archivo(s) con cambios sin comitear)</w:t>
             </w:r>
           </w:p>
         </w:tc>
@@ -15730,7 +15730,7 @@
                 <w:sz w:val="19"/>
                 <w:szCs w:val="19"/>
               </w:rPr>
-              <w:t xml:space="preserve">v22.23.3</w:t>
+              <w:t xml:space="preserve">v22.23.4</w:t>
             </w:r>
           </w:p>
         </w:tc>
@@ -16002,7 +16002,7 @@
                 <w:sz w:val="19"/>
                 <w:szCs w:val="19"/>
               </w:rPr>
-              <w:t xml:space="preserve">nginx/1.31.6</w:t>
+              <w:t xml:space="preserve">nginx/1.31.8</w:t>
             </w:r>
           </w:p>
         </w:tc>

</xml_diff>